<commit_message>
Use collapsible group cards and uniform weekday names.
</commit_message>
<xml_diff>
--- a/rabochie-gruppy-2026-2027.docx
+++ b/rabochie-gruppy-2026-2027.docx
@@ -313,7 +313,7 @@
                 <w:b/>
                 <w:sz w:val="22"/>
               </w:rPr>
-              <w:t>Чт</w:t>
+              <w:t>Четверг</w:t>
             </w:r>
             <w:r>
               <w:rPr>
@@ -450,23 +450,7 @@
                 <w:b w:val="0"/>
                 <w:sz w:val="22"/>
               </w:rPr>
-              <w:t xml:space="preserve">, </w:t>
-            </w:r>
-            <w:r>
-              <w:rPr>
-                <w:rFonts w:ascii="Montserrat" w:hAnsi="Montserrat"/>
-                <w:b/>
-                <w:sz w:val="22"/>
-              </w:rPr>
-              <w:t>1 раз в месяц</w:t>
-            </w:r>
-            <w:r>
-              <w:rPr>
-                <w:rFonts w:ascii="Montserrat" w:hAnsi="Montserrat"/>
-                <w:b w:val="0"/>
-                <w:sz w:val="22"/>
-              </w:rPr>
-              <w:t xml:space="preserve">, </w:t>
+              <w:t xml:space="preserve">, 1 раз в месяц, </w:t>
             </w:r>
             <w:r>
               <w:rPr>
@@ -611,15 +595,15 @@
                 <w:b/>
                 <w:sz w:val="22"/>
               </w:rPr>
-              <w:t>2-й понедельник</w:t>
-            </w:r>
-            <w:r>
-              <w:rPr>
-                <w:rFonts w:ascii="Montserrat" w:hAnsi="Montserrat"/>
-                <w:b w:val="0"/>
-                <w:sz w:val="22"/>
-              </w:rPr>
-              <w:t xml:space="preserve">, 1 раз в месяц, </w:t>
+              <w:t>Понедельник</w:t>
+            </w:r>
+            <w:r>
+              <w:rPr>
+                <w:rFonts w:ascii="Montserrat" w:hAnsi="Montserrat"/>
+                <w:b w:val="0"/>
+                <w:sz w:val="22"/>
+              </w:rPr>
+              <w:t xml:space="preserve">, 2-й в месяц, </w:t>
             </w:r>
             <w:r>
               <w:rPr>
@@ -653,15 +637,15 @@
                 <w:b/>
                 <w:sz w:val="22"/>
               </w:rPr>
-              <w:t>1-я и 3-я среда</w:t>
-            </w:r>
-            <w:r>
-              <w:rPr>
-                <w:rFonts w:ascii="Montserrat" w:hAnsi="Montserrat"/>
-                <w:b w:val="0"/>
-                <w:sz w:val="22"/>
-              </w:rPr>
-              <w:t xml:space="preserve">, </w:t>
+              <w:t>Среда</w:t>
+            </w:r>
+            <w:r>
+              <w:rPr>
+                <w:rFonts w:ascii="Montserrat" w:hAnsi="Montserrat"/>
+                <w:b w:val="0"/>
+                <w:sz w:val="22"/>
+              </w:rPr>
+              <w:t xml:space="preserve">, 1-я и 3-я в месяц, </w:t>
             </w:r>
             <w:r>
               <w:rPr>
@@ -884,15 +868,15 @@
                 <w:b/>
                 <w:sz w:val="22"/>
               </w:rPr>
-              <w:t>2-я и 4-я среда</w:t>
-            </w:r>
-            <w:r>
-              <w:rPr>
-                <w:rFonts w:ascii="Montserrat" w:hAnsi="Montserrat"/>
-                <w:b w:val="0"/>
-                <w:sz w:val="22"/>
-              </w:rPr>
-              <w:t xml:space="preserve">, </w:t>
+              <w:t>Среда</w:t>
+            </w:r>
+            <w:r>
+              <w:rPr>
+                <w:rFonts w:ascii="Montserrat" w:hAnsi="Montserrat"/>
+                <w:b w:val="0"/>
+                <w:sz w:val="22"/>
+              </w:rPr>
+              <w:t xml:space="preserve">, 2-я и 4-я в месяц, </w:t>
             </w:r>
             <w:r>
               <w:rPr>
@@ -1087,7 +1071,7 @@
                 <w:b/>
                 <w:sz w:val="22"/>
               </w:rPr>
-              <w:t>По четвергам</w:t>
+              <w:t>Четверг</w:t>
             </w:r>
             <w:r>
               <w:rPr>
@@ -1103,23 +1087,23 @@
                 <w:b/>
                 <w:sz w:val="22"/>
               </w:rPr>
+              <w:t>21:30–22:30</w:t>
+            </w:r>
+            <w:r>
+              <w:rPr>
+                <w:rFonts w:ascii="Montserrat" w:hAnsi="Montserrat"/>
+                <w:b w:val="0"/>
+                <w:sz w:val="22"/>
+              </w:rPr>
+              <w:t xml:space="preserve">, </w:t>
+            </w:r>
+            <w:r>
+              <w:rPr>
+                <w:rFonts w:ascii="Montserrat" w:hAnsi="Montserrat"/>
+                <w:b/>
+                <w:sz w:val="22"/>
+              </w:rPr>
               <w:t>Zoom</w:t>
-            </w:r>
-            <w:r>
-              <w:rPr>
-                <w:rFonts w:ascii="Montserrat" w:hAnsi="Montserrat"/>
-                <w:b w:val="0"/>
-                <w:sz w:val="22"/>
-              </w:rPr>
-              <w:t xml:space="preserve">, </w:t>
-            </w:r>
-            <w:r>
-              <w:rPr>
-                <w:rFonts w:ascii="Montserrat" w:hAnsi="Montserrat"/>
-                <w:b/>
-                <w:sz w:val="22"/>
-              </w:rPr>
-              <w:t>21:30–22:30</w:t>
             </w:r>
           </w:p>
         </w:tc>
@@ -1290,31 +1274,15 @@
                 <w:b/>
                 <w:sz w:val="22"/>
               </w:rPr>
-              <w:t>По вторникам</w:t>
-            </w:r>
-            <w:r>
-              <w:rPr>
-                <w:rFonts w:ascii="Montserrat" w:hAnsi="Montserrat"/>
-                <w:b w:val="0"/>
-                <w:sz w:val="22"/>
-              </w:rPr>
-              <w:t xml:space="preserve">, </w:t>
-            </w:r>
-            <w:r>
-              <w:rPr>
-                <w:rFonts w:ascii="Montserrat" w:hAnsi="Montserrat"/>
-                <w:b/>
-                <w:sz w:val="22"/>
-              </w:rPr>
-              <w:t>1 раз в месяц</w:t>
-            </w:r>
-            <w:r>
-              <w:rPr>
-                <w:rFonts w:ascii="Montserrat" w:hAnsi="Montserrat"/>
-                <w:b w:val="0"/>
-                <w:sz w:val="22"/>
-              </w:rPr>
-              <w:t xml:space="preserve">, </w:t>
+              <w:t>Вторник</w:t>
+            </w:r>
+            <w:r>
+              <w:rPr>
+                <w:rFonts w:ascii="Montserrat" w:hAnsi="Montserrat"/>
+                <w:b w:val="0"/>
+                <w:sz w:val="22"/>
+              </w:rPr>
+              <w:t xml:space="preserve">, 1 раз в месяц, </w:t>
             </w:r>
             <w:r>
               <w:rPr>

</xml_diff>